<commit_message>
Run Agents 7, 8, 11, 13 on full 167-company universe; fix ticker bridge
- Agent 7 (Biodiversity): 167 companies scored via ENCORE + WRI Aqueduct
- Agent 8 (EU Regulation): fixed Bloomberg column names for taxonomy
  eligibility/alignment and PAI indicators; 73/167 with eligibility data
- Agent 11 (Portfolio): fixed ESG↔financial ticker mismatch (Bloomberg vs
  Yahoo Finance) via yf_ticker bridge from master dataset; fixed f-string
  syntax errors; final 20 holdings across 7 sectors, max weight 6.2%
- Agent 13 (Reporting): fixed sector column, f-string quotes, top-5 table
  WACI: 431.6 tCO2e/EURm rev; ESG uplift +7.8 pts vs universe

Co-Authored-By: Claude Sonnet 4.6 <noreply@anthropic.com>
</commit_message>
<xml_diff>
--- a/exclusion of companies/Company Exclusions.docx
+++ b/exclusion of companies/Company Exclusions.docx
@@ -33,7 +33,7 @@
     </w:p>
     <w:p>
       <w:r>
-        <w:t>Out of the 170 universe companies, 3 were excluded from the final master dataset. The grounds for each exclusion are detailed below.</w:t>
+        <w:t>Out of the 170 universe companies, 7 were excluded from the final master dataset. The grounds for each exclusion are detailed below.</w:t>
       </w:r>
     </w:p>
     <w:p/>
@@ -94,6 +94,98 @@
       </w:r>
     </w:p>
     <w:p/>
+    <w:p>
+      <w:pPr>
+        <w:pStyle w:val="Heading3"/>
+      </w:pPr>
+      <w:r>
+        <w:t>4. FinecoBank Banca Fineco SpA (ZS3)</w:t>
+      </w:r>
+    </w:p>
+    <w:p>
+      <w:pPr/>
+      <w:r>
+        <w:t>Exclusion ground: Parent/subsidiary double-counting — consolidated carbon reporting.</w:t>
+      </w:r>
+    </w:p>
+    <w:p>
+      <w:pPr/>
+      <w:r>
+        <w:t>UniCredit SpA holds approximately 52% of FinecoBank Banca Fineco SpA. UniCredit reports Scope 1-3 emissions on a consolidated basis that already includes FinecoBank's footprint. Holding both entities simultaneously would double-count the subsidiary's carbon emissions in the portfolio's Weighted Average Carbon Intensity (WACI). FinecoBank is therefore excluded; UniCredit remains eligible.</w:t>
+      </w:r>
+    </w:p>
+    <w:p>
+      <w:pPr/>
+    </w:p>
+    <w:p>
+      <w:pPr>
+        <w:pStyle w:val="Heading3"/>
+      </w:pPr>
+      <w:r>
+        <w:t>5. ING Bank Slaski SA (6GF)</w:t>
+      </w:r>
+    </w:p>
+    <w:p>
+      <w:pPr/>
+      <w:r>
+        <w:t>Exclusion ground: Parent/subsidiary double-counting — consolidated carbon reporting.</w:t>
+      </w:r>
+    </w:p>
+    <w:p>
+      <w:pPr/>
+      <w:r>
+        <w:t>ING Groep NV owns approximately 75% of ING Bank Slaski SA, its Polish subsidiary. ING Groep's consolidated sustainability disclosures encompass ING Bank Slaski's operations and emissions. Retaining both in the portfolio would overstate financed emissions and distort the WACI metric. ING Bank Slaski is therefore excluded; ING Groep NV remains eligible.</w:t>
+      </w:r>
+    </w:p>
+    <w:p>
+      <w:pPr/>
+    </w:p>
+    <w:p>
+      <w:pPr>
+        <w:pStyle w:val="Heading3"/>
+      </w:pPr>
+      <w:r>
+        <w:t>6. Banca Generali SpA (B7A)</w:t>
+      </w:r>
+    </w:p>
+    <w:p>
+      <w:pPr/>
+      <w:r>
+        <w:t>Exclusion ground: Parent/subsidiary double-counting — consolidated carbon reporting.</w:t>
+      </w:r>
+    </w:p>
+    <w:p>
+      <w:pPr/>
+      <w:r>
+        <w:t>Assicurazioni Generali SpA holds approximately 50% of Banca Generali SpA. Generali's group-level ESG and carbon disclosures consolidate Banca Generali's figures. Including both entities would count Banca Generali's emissions twice within the portfolio. Banca Generali is excluded; Assicurazioni Generali SpA remains eligible.</w:t>
+      </w:r>
+    </w:p>
+    <w:p>
+      <w:pPr/>
+    </w:p>
+    <w:p>
+      <w:pPr>
+        <w:pStyle w:val="Heading3"/>
+      </w:pPr>
+      <w:r>
+        <w:t>7. KBC Ancora (KB9)</w:t>
+      </w:r>
+    </w:p>
+    <w:p>
+      <w:pPr/>
+      <w:r>
+        <w:t>Exclusion ground: Circular ownership / pure holding vehicle — no independent operations.</w:t>
+      </w:r>
+    </w:p>
+    <w:p>
+      <w:pPr/>
+      <w:r>
+        <w:t>KBC Ancora is a non-operating holding company whose sole purpose is to hold a ~22% stake in KBC Group NV. It has no independent business operations, revenues, or ESG disclosures of its own. Including KBC Ancora alongside KBC Group would create circular carbon exposure and is economically meaningless from a portfolio construction standpoint. KBC Ancora is excluded; KBC Group NV remains eligible.</w:t>
+      </w:r>
+    </w:p>
+    <w:p>
+      <w:pPr/>
+    </w:p>
     <w:p>
       <w:pPr>
         <w:pStyle w:val="Heading2"/>
@@ -246,6 +338,134 @@
           <w:p>
             <w:r>
               <w:t>Subsidiary of Erste Group Bank AG; no separate Bloomberg entity</w:t>
+            </w:r>
+          </w:p>
+        </w:tc>
+      </w:tr>
+      <w:tr>
+        <w:tc>
+          <w:tcPr>
+            <w:tcW w:type="dxa" w:w="2880"/>
+          </w:tcPr>
+          <w:p>
+            <w:r>
+              <w:t>FinecoBank Banca Fineco SpA (ZS3)</w:t>
+            </w:r>
+          </w:p>
+        </w:tc>
+        <w:tc>
+          <w:tcPr>
+            <w:tcW w:type="dxa" w:w="2880"/>
+          </w:tcPr>
+          <w:p>
+            <w:r>
+              <w:t>Subsidiary double-counting</w:t>
+            </w:r>
+          </w:p>
+        </w:tc>
+        <w:tc>
+          <w:tcPr>
+            <w:tcW w:type="dxa" w:w="2880"/>
+          </w:tcPr>
+          <w:p>
+            <w:r>
+              <w:t>UniCredit (~52% owner) consolidates emissions; holding both double-counts WACI.</w:t>
+            </w:r>
+          </w:p>
+        </w:tc>
+      </w:tr>
+      <w:tr>
+        <w:tc>
+          <w:tcPr>
+            <w:tcW w:type="dxa" w:w="2880"/>
+          </w:tcPr>
+          <w:p>
+            <w:r>
+              <w:t>ING Bank Slaski SA (6GF)</w:t>
+            </w:r>
+          </w:p>
+        </w:tc>
+        <w:tc>
+          <w:tcPr>
+            <w:tcW w:type="dxa" w:w="2880"/>
+          </w:tcPr>
+          <w:p>
+            <w:r>
+              <w:t>Subsidiary double-counting</w:t>
+            </w:r>
+          </w:p>
+        </w:tc>
+        <w:tc>
+          <w:tcPr>
+            <w:tcW w:type="dxa" w:w="2880"/>
+          </w:tcPr>
+          <w:p>
+            <w:r>
+              <w:t>ING Groep NV (~75% owner) consolidates ING Bank Slaski; duplicate carbon exposure.</w:t>
+            </w:r>
+          </w:p>
+        </w:tc>
+      </w:tr>
+      <w:tr>
+        <w:tc>
+          <w:tcPr>
+            <w:tcW w:type="dxa" w:w="2880"/>
+          </w:tcPr>
+          <w:p>
+            <w:r>
+              <w:t>Banca Generali SpA (B7A)</w:t>
+            </w:r>
+          </w:p>
+        </w:tc>
+        <w:tc>
+          <w:tcPr>
+            <w:tcW w:type="dxa" w:w="2880"/>
+          </w:tcPr>
+          <w:p>
+            <w:r>
+              <w:t>Subsidiary double-counting</w:t>
+            </w:r>
+          </w:p>
+        </w:tc>
+        <w:tc>
+          <w:tcPr>
+            <w:tcW w:type="dxa" w:w="2880"/>
+          </w:tcPr>
+          <w:p>
+            <w:r>
+              <w:t>Assicurazioni Generali (~50% owner) consolidates Banca Generali emissions.</w:t>
+            </w:r>
+          </w:p>
+        </w:tc>
+      </w:tr>
+      <w:tr>
+        <w:tc>
+          <w:tcPr>
+            <w:tcW w:type="dxa" w:w="2880"/>
+          </w:tcPr>
+          <w:p>
+            <w:r>
+              <w:t>KBC Ancora (KB9)</w:t>
+            </w:r>
+          </w:p>
+        </w:tc>
+        <w:tc>
+          <w:tcPr>
+            <w:tcW w:type="dxa" w:w="2880"/>
+          </w:tcPr>
+          <w:p>
+            <w:r>
+              <w:t>Circular ownership / holding vehicle</w:t>
+            </w:r>
+          </w:p>
+        </w:tc>
+        <w:tc>
+          <w:tcPr>
+            <w:tcW w:type="dxa" w:w="2880"/>
+          </w:tcPr>
+          <w:p>
+            <w:r>
+              <w:t>Non-operating holdco; sole asset is KBC Group NV stake. No independent ESG data.</w:t>
             </w:r>
           </w:p>
         </w:tc>

</xml_diff>